<commit_message>
Career-break front: constructive framing, horse-race note as rolling one-month-ahead tests, scope headings, grouping move
</commit_message>
<xml_diff>
--- a/notes/ai-assisted-model-workflow/index.docx
+++ b/notes/ai-assisted-model-workflow/index.docx
@@ -691,13 +691,13 @@
       </w:r>
     </w:p>
     <w:bookmarkEnd w:id="27"/>
-    <w:bookmarkStart w:id="28" w:name="limits-and-next-steps"/>
+    <w:bookmarkStart w:id="28" w:name="scope-and-next-steps"/>
     <w:p>
       <w:pPr>
         <w:pStyle w:val="Heading2"/>
       </w:pPr>
       <w:r>
-        <w:t xml:space="preserve">Limits and next steps</w:t>
+        <w:t xml:space="preserve">Scope and next steps</w:t>
       </w:r>
     </w:p>
     <w:p>
@@ -755,7 +755,7 @@
         <w:t xml:space="preserve"> </w:t>
       </w:r>
       <w:r>
-        <w:t xml:space="preserve">are generated from simulated data built to share the structure of the analysis (its variables, horizons and frequencies). They show how the method works and what its output looks like; they are not the project’s results. Results stated in the text are the project’s own. Methods are described at the level of a methods section. Code and data pipelines are not reproduced here.</w:t>
+        <w:t xml:space="preserve">are generated from simulated data built to share the structure of the analysis (its variables, horizons and frequencies). They show how each method works and what its output looks like. Results stated in the text, and figures that give a source, are the project’s own. Methods are described at the level of a methods section. Code and data pipelines are not reproduced here.</w:t>
       </w:r>
     </w:p>
     <w:bookmarkEnd w:id="29"/>

</xml_diff>

<commit_message>
Portfolio S20: constructive Scope and next steps across 20 notes; demographics figure shows final estimates only
</commit_message>
<xml_diff>
--- a/notes/ai-assisted-model-workflow/index.docx
+++ b/notes/ai-assisted-model-workflow/index.docx
@@ -705,7 +705,7 @@
         <w:pStyle w:val="FirstParagraph"/>
       </w:pPr>
       <w:r>
-        <w:t xml:space="preserve">The workflow shows that machine-assisted work can be made traceable. It does not show that the models forecast well, and nothing here should be read as estimates on real data. The model is a minimal linear core. The full forward-looking solution with rational expectations is not implemented, the fiscal block is reduced to a simple additive term rather than full debt dynamics, and the political-risk correction is a non-structural add-on rather than a rule embedded in a structural model. Those are the documented gaps, and each is a research task in its own right.</w:t>
+        <w:t xml:space="preserve">The workflow is built to make machine-assisted model building traceable end to end: each number carries its source, its age and the code that produced it, and the model’s filter is checked on simulated data, where the true state is known.</w:t>
       </w:r>
     </w:p>
     <w:p>
@@ -713,7 +713,15 @@
         <w:pStyle w:val="BodyText"/>
       </w:pPr>
       <w:r>
-        <w:t xml:space="preserve">Three steps would strengthen the work. First, solve the forward-looking model and test that the structural version reduces to the current one in the appropriate limit, using the same equivalence logic. Second, run the workflow on real data, with the same logging, and compare the audit trail with the simulated one. Third, put the checks into an automated gate that fails a run whenever an expected artefact or provenance record is missing, so the discipline does not depend on anyone remembering it.</w:t>
+        <w:t xml:space="preserve">The natural extensions are three. First, solving the full forward-looking model with rational expectations, a complete fiscal debt block and the political-risk adjustment inside the policy rule, and confirming that it reduces to the current core in the appropriate limit. Second, running the same logged workflow on real data and comparing its audit trail with the simulated one. Third, turning the checks into an automated gate that stops any run whose expected outputs or provenance records are missing.</w:t>
+      </w:r>
+    </w:p>
+    <w:p>
+      <w:pPr>
+        <w:pStyle w:val="BodyText"/>
+      </w:pPr>
+      <w:r>
+        <w:t xml:space="preserve">The full protocol and worked examples can be discussed on request.</w:t>
       </w:r>
     </w:p>
     <w:bookmarkEnd w:id="28"/>

</xml_diff>